<commit_message>
Switch target journal to PLOS ONE: non-structured 298-word abstract, PLOS ONE cover letter, refreshed MANIFEST (82 artifacts), venue reevaluation after GigaScience 2025 editorial crisis. Re-point v1.0.0 to submission-ready PLOS ONE state.
</commit_message>
<xml_diff>
--- a/manuscript/cover_letter.docx
+++ b/manuscript/cover_letter.docx
@@ -28,7 +28,7 @@
           <w:i w:val="0"/>
           <w:sz w:val="24"/>
         </w:rPr>
-        <w:t>The Editor-in-Chief</w:t>
+        <w:t>The Editor</w:t>
       </w:r>
     </w:p>
     <w:p>
@@ -38,7 +38,7 @@
           <w:i w:val="0"/>
           <w:sz w:val="24"/>
         </w:rPr>
-        <w:t>GigaScience</w:t>
+        <w:t>PLOS ONE</w:t>
       </w:r>
     </w:p>
     <w:p>
@@ -48,7 +48,7 @@
           <w:i w:val="0"/>
           <w:sz w:val="24"/>
         </w:rPr>
-        <w:t>Oxford Academic / GigaScience Press</w:t>
+        <w:t>Public Library of Science</w:t>
       </w:r>
     </w:p>
     <w:p>
@@ -81,7 +81,7 @@
     </w:p>
     <w:p>
       <w:r>
-        <w:t>Please consider our Research Article entitled “A controlled stiffness signature does not transfer to neuropathic-pain transcriptomes, while established ECM gene sets retain tissue specificity” for publication in GigaScience.</w:t>
+        <w:t>Please consider our Research Article entitled “A controlled stiffness signature does not transfer to neuropathic-pain transcriptomes, while established ECM gene sets retain tissue specificity” for publication in PLOS ONE.</w:t>
       </w:r>
     </w:p>
     <w:p>
@@ -95,7 +95,7 @@
     </w:p>
     <w:p>
       <w:r>
-        <w:t>We report a prospectively specified, two-stage reanalysis testing whether a mechanically controlled (substrate-stiffness) transcriptional programme, derived from HEK293A (GSE98547), engages pain-relevant tissues (dorsal root ganglion, spinal cord) after nerve injury. The signature was biologically anchored (CTGF Δ = +1.64, P = 9.5 × 10⁻⁶) and the pipeline’s sensitivity was confirmed by a literature-derived nerve-injury gene set (Hedges g = 3.85, P = 0.0286). The pre-registered conclusion is that the HEK293A-derived stiffness programme does not transfer to injured DRG (bounded, sensitivity-validated null), whereas, once baseline-expression confounding is controlled, established ECM / mechanotransduction gene sets retain tissue specificity in pain transcriptomes (4/5 sets show stronger DRG-than-blood shift). The work is thus both a negative result (the projected signature fails) and a positive, methodology-driven correction to prior “ECM enrichment in pain” interpretations — a fit for GigaScience’s readership, which values rigour, open data, and reusable analytical workflows.</w:t>
+        <w:t>We report a prospectively specified, two-stage reanalysis testing whether a mechanically controlled (substrate-stiffness) transcriptional programme, derived from HEK293A (GSE98547), engages pain-relevant tissues (dorsal root ganglion, spinal cord) after nerve injury. The signature was biologically anchored (CTGF Δ = +1.64, P = 9.5 × 10⁻⁶) and the pipeline’s sensitivity was confirmed by a literature-derived nerve-injury gene set (Hedges g = 3.85, P = 0.0286). The pre-registered conclusion is that the HEK293A-derived stiffness programme does not transfer to injured DRG (bounded, sensitivity-validated null), whereas, once baseline-expression confounding is controlled, established ECM / mechanotransduction gene sets retain tissue specificity in pain transcriptomes (4/5 sets show stronger DRG-than-blood shift). The work is thus both a negative result (the projected signature fails) and a positive, methodology-driven correction to prior “ECM enrichment in pain” interpretations — a fit for PLOS ONE’s readership, which values rigour, open data, and reusable analytical workflows.</w:t>
       </w:r>
     </w:p>
     <w:p>

</xml_diff>

<commit_message>
Round-3 must-fix revisions: reframe Stage A as double-null, qualify Layer-3 overclaims, add Figure Legends, align cover letter, +4 gate assertions (43/43 PASS)
</commit_message>
<xml_diff>
--- a/manuscript/cover_letter.docx
+++ b/manuscript/cover_letter.docx
@@ -81,7 +81,7 @@
     </w:p>
     <w:p>
       <w:r>
-        <w:t>Please consider our Research Article entitled “A controlled stiffness signature does not transfer to neuropathic-pain transcriptomes, while established ECM gene sets retain tissue specificity” for publication in PLOS ONE.</w:t>
+        <w:t>Please consider our Research Article entitled “A controlled stiffness signature does not transfer to neuropathic-pain transcriptomes, while established ECM/mechanotransduction gene sets show tissue-specific shifts” for publication in PLOS ONE.</w:t>
       </w:r>
     </w:p>
     <w:p>
@@ -95,7 +95,7 @@
     </w:p>
     <w:p>
       <w:r>
-        <w:t>We report a prospectively specified, two-stage reanalysis testing whether a mechanically controlled (substrate-stiffness) transcriptional programme, derived from HEK293A (GSE98547), engages pain-relevant tissues (dorsal root ganglion, spinal cord) after nerve injury. The signature was biologically anchored (CTGF Δ = +1.64, P = 9.5 × 10⁻⁶) and the pipeline’s sensitivity was confirmed by a literature-derived nerve-injury gene set (Hedges g = 3.85, P = 0.0286). The pre-registered conclusion is that the HEK293A-derived stiffness programme does not transfer to injured DRG (bounded, sensitivity-validated null), whereas, once baseline-expression confounding is controlled, established ECM / mechanotransduction gene sets retain tissue specificity in pain transcriptomes (4/5 sets show stronger DRG-than-blood shift). The work is thus both a negative result (the projected signature fails) and a positive, methodology-driven correction to prior “ECM enrichment in pain” interpretations — a fit for PLOS ONE’s readership, which values rigour, open data, and reusable analytical workflows.</w:t>
+        <w:t>We report a prospectively specified, two-stage reanalysis testing whether a mechanically controlled (substrate-stiffness) transcriptional programme, derived from HEK293A (GSE98547), engages pain-relevant tissues (dorsal root ganglion, spinal cord) after nerve injury. The signature was biologically anchored (CTGF Δ = +1.64, P = 9.5 × 10⁻⁶) and the pipeline’s sensitivity was confirmed by a literature-derived nerve-injury gene set (Hedges g = 3.85, P = 0.0286). The pre-registered conclusion is that the HEK293A-derived stiffness programme does not transfer to injured DRG (a sample-level, sensitivity-validated null rather than a method artifact), whereas established ECM / mechanotransduction gene sets retain a DRG-over-blood shift once baseline-expression confounding is controlled. That positive reading is qualified: G1 and G5 overlap by 10 genes and G4's large ratio is a denominator artefact, so the apparent '4/5' is inflated and the genuine independent wins are G1, G3, and G5. The work is thus both a negative result (the projected signature fails) and a methodology-driven correction to prior “ECM enrichment in pain” interpretations — a fit for PLOS ONE’s readership, which values rigour, open data, and reusable analytical workflows.</w:t>
       </w:r>
     </w:p>
     <w:p>

</xml_diff>